<commit_message>
Updated some table errors and made the docker image, but it is a little too big to push
</commit_message>
<xml_diff>
--- a/Assignment1_Group1_Report.docx
+++ b/Assignment1_Group1_Report.docx
@@ -5020,10 +5020,10 @@
         <w:tblLook w:val="04A0" w:firstRow="1" w:lastRow="0" w:firstColumn="1" w:lastColumn="0" w:noHBand="0" w:noVBand="1"/>
       </w:tblPr>
       <w:tblGrid>
-        <w:gridCol w:w="2819"/>
-        <w:gridCol w:w="795"/>
-        <w:gridCol w:w="1134"/>
-        <w:gridCol w:w="4836"/>
+        <w:gridCol w:w="3277"/>
+        <w:gridCol w:w="784"/>
+        <w:gridCol w:w="1104"/>
+        <w:gridCol w:w="4419"/>
       </w:tblGrid>
       <w:tr>
         <w:tc>
@@ -5129,7 +5129,58 @@
                 <w:rFonts w:ascii="Calibri" w:hAnsi="Calibri" w:cs="Calibri"/>
                 <w:lang w:val="en-GB"/>
               </w:rPr>
-              <w:t>Naive_server_T50/T20.txt</w:t>
+              <w:t>n</w:t>
+            </w:r>
+            <w:r>
+              <w:rPr>
+                <w:rFonts w:ascii="Calibri" w:hAnsi="Calibri" w:cs="Calibri"/>
+                <w:lang w:val="en-GB"/>
+              </w:rPr>
+              <w:t>aive_T50</w:t>
+            </w:r>
+            <w:r>
+              <w:rPr>
+                <w:rFonts w:ascii="Calibri" w:hAnsi="Calibri" w:cs="Calibri"/>
+                <w:lang w:val="en-GB"/>
+              </w:rPr>
+              <w:t xml:space="preserve">.txt </w:t>
+            </w:r>
+            <w:r>
+              <w:rPr>
+                <w:rFonts w:ascii="Calibri" w:hAnsi="Calibri" w:cs="Calibri"/>
+                <w:lang w:val="en-GB"/>
+              </w:rPr>
+              <w:t>/</w:t>
+            </w:r>
+            <w:r>
+              <w:rPr>
+                <w:rFonts w:ascii="Calibri" w:hAnsi="Calibri" w:cs="Calibri"/>
+                <w:lang w:val="en-GB"/>
+              </w:rPr>
+              <w:t xml:space="preserve"> </w:t>
+            </w:r>
+          </w:p>
+          <w:p>
+            <w:pPr>
+              <w:pStyle w:val="Brdtekst"/>
+              <w:rPr>
+                <w:rFonts w:ascii="Calibri" w:hAnsi="Calibri" w:cs="Calibri"/>
+                <w:lang w:val="en-GB"/>
+              </w:rPr>
+            </w:pPr>
+            <w:r>
+              <w:rPr>
+                <w:rFonts w:ascii="Calibri" w:hAnsi="Calibri" w:cs="Calibri"/>
+                <w:lang w:val="en-GB"/>
+              </w:rPr>
+              <w:t>naive_</w:t>
+            </w:r>
+            <w:r>
+              <w:rPr>
+                <w:rFonts w:ascii="Calibri" w:hAnsi="Calibri" w:cs="Calibri"/>
+                <w:lang w:val="en-GB"/>
+              </w:rPr>
+              <w:t>T20.txt</w:t>
             </w:r>
           </w:p>
         </w:tc>
@@ -5210,22 +5261,153 @@
                 <w:lang w:val="en-GB"/>
               </w:rPr>
             </w:pPr>
-            <w:proofErr w:type="spellStart"/>
             <w:r>
               <w:rPr>
                 <w:rFonts w:ascii="Calibri" w:hAnsi="Calibri" w:cs="Calibri"/>
                 <w:lang w:val="en-GB"/>
               </w:rPr>
               <w:lastRenderedPageBreak/>
-              <w:t>Server_cache_FIFO</w:t>
+              <w:t>s</w:t>
             </w:r>
-            <w:proofErr w:type="spellEnd"/>
             <w:r>
               <w:rPr>
                 <w:rFonts w:ascii="Calibri" w:hAnsi="Calibri" w:cs="Calibri"/>
                 <w:lang w:val="en-GB"/>
               </w:rPr>
-              <w:t xml:space="preserve"> / OLDEST_T50/T20.txt</w:t>
+              <w:t>erver_cache_FIFO</w:t>
+            </w:r>
+            <w:r>
+              <w:rPr>
+                <w:rFonts w:ascii="Calibri" w:hAnsi="Calibri" w:cs="Calibri"/>
+                <w:lang w:val="en-GB"/>
+              </w:rPr>
+              <w:t>_T50.txt</w:t>
+            </w:r>
+            <w:r>
+              <w:rPr>
+                <w:rFonts w:ascii="Calibri" w:hAnsi="Calibri" w:cs="Calibri"/>
+                <w:lang w:val="en-GB"/>
+              </w:rPr>
+              <w:t xml:space="preserve">/ </w:t>
+            </w:r>
+            <w:r>
+              <w:rPr>
+                <w:rFonts w:ascii="Calibri" w:hAnsi="Calibri" w:cs="Calibri"/>
+                <w:lang w:val="en-GB"/>
+              </w:rPr>
+              <w:t>s</w:t>
+            </w:r>
+            <w:r>
+              <w:rPr>
+                <w:rFonts w:ascii="Calibri" w:hAnsi="Calibri" w:cs="Calibri"/>
+                <w:lang w:val="en-GB"/>
+              </w:rPr>
+              <w:t>erver_cache_FIFO</w:t>
+            </w:r>
+            <w:r>
+              <w:rPr>
+                <w:rFonts w:ascii="Calibri" w:hAnsi="Calibri" w:cs="Calibri"/>
+                <w:lang w:val="en-GB"/>
+              </w:rPr>
+              <w:t>_T</w:t>
+            </w:r>
+            <w:r>
+              <w:rPr>
+                <w:rFonts w:ascii="Calibri" w:hAnsi="Calibri" w:cs="Calibri"/>
+                <w:lang w:val="en-GB"/>
+              </w:rPr>
+              <w:t>2</w:t>
+            </w:r>
+            <w:r>
+              <w:rPr>
+                <w:rFonts w:ascii="Calibri" w:hAnsi="Calibri" w:cs="Calibri"/>
+                <w:lang w:val="en-GB"/>
+              </w:rPr>
+              <w:t>0.txt</w:t>
+            </w:r>
+            <w:r>
+              <w:rPr>
+                <w:rFonts w:ascii="Calibri" w:hAnsi="Calibri" w:cs="Calibri"/>
+                <w:lang w:val="en-GB"/>
+              </w:rPr>
+              <w:t xml:space="preserve">/ </w:t>
+            </w:r>
+            <w:r>
+              <w:rPr>
+                <w:rFonts w:ascii="Calibri" w:hAnsi="Calibri" w:cs="Calibri"/>
+                <w:lang w:val="en-GB"/>
+              </w:rPr>
+              <w:t>s</w:t>
+            </w:r>
+            <w:r>
+              <w:rPr>
+                <w:rFonts w:ascii="Calibri" w:hAnsi="Calibri" w:cs="Calibri"/>
+                <w:lang w:val="en-GB"/>
+              </w:rPr>
+              <w:t>erver_cache_</w:t>
+            </w:r>
+            <w:r>
+              <w:rPr>
+                <w:rFonts w:ascii="Calibri" w:hAnsi="Calibri" w:cs="Calibri"/>
+                <w:lang w:val="en-GB"/>
+              </w:rPr>
+              <w:t>OLDEST_T50</w:t>
+            </w:r>
+            <w:r>
+              <w:rPr>
+                <w:rFonts w:ascii="Calibri" w:hAnsi="Calibri" w:cs="Calibri"/>
+                <w:lang w:val="en-GB"/>
+              </w:rPr>
+              <w:t>.txt</w:t>
+            </w:r>
+            <w:r>
+              <w:rPr>
+                <w:rFonts w:ascii="Calibri" w:hAnsi="Calibri" w:cs="Calibri"/>
+                <w:lang w:val="en-GB"/>
+              </w:rPr>
+              <w:t xml:space="preserve">/ </w:t>
+            </w:r>
+            <w:r>
+              <w:rPr>
+                <w:rFonts w:ascii="Calibri" w:hAnsi="Calibri" w:cs="Calibri"/>
+                <w:lang w:val="en-GB"/>
+              </w:rPr>
+              <w:t>s</w:t>
+            </w:r>
+            <w:r>
+              <w:rPr>
+                <w:rFonts w:ascii="Calibri" w:hAnsi="Calibri" w:cs="Calibri"/>
+                <w:lang w:val="en-GB"/>
+              </w:rPr>
+              <w:t>erver_cache_</w:t>
+            </w:r>
+            <w:r>
+              <w:rPr>
+                <w:rFonts w:ascii="Calibri" w:hAnsi="Calibri" w:cs="Calibri"/>
+                <w:lang w:val="en-GB"/>
+              </w:rPr>
+              <w:t>OLDEST_T</w:t>
+            </w:r>
+            <w:r>
+              <w:rPr>
+                <w:rFonts w:ascii="Calibri" w:hAnsi="Calibri" w:cs="Calibri"/>
+                <w:lang w:val="en-GB"/>
+              </w:rPr>
+              <w:t>2</w:t>
+            </w:r>
+            <w:r>
+              <w:rPr>
+                <w:rFonts w:ascii="Calibri" w:hAnsi="Calibri" w:cs="Calibri"/>
+                <w:lang w:val="en-GB"/>
+              </w:rPr>
+              <w:t>0</w:t>
+            </w:r>
+            <w:r>
+              <w:rPr>
+                <w:rFonts w:ascii="Calibri" w:hAnsi="Calibri" w:cs="Calibri"/>
+                <w:lang w:val="en-GB"/>
+              </w:rPr>
+              <w:t>.txt</w:t>
             </w:r>
           </w:p>
         </w:tc>
@@ -5306,21 +5488,119 @@
                 <w:lang w:val="en-GB"/>
               </w:rPr>
             </w:pPr>
-            <w:proofErr w:type="spellStart"/>
             <w:r>
               <w:rPr>
                 <w:rFonts w:ascii="Calibri" w:hAnsi="Calibri" w:cs="Calibri"/>
                 <w:lang w:val="en-GB"/>
               </w:rPr>
-              <w:t>Client_cache_FIFO</w:t>
+              <w:t>client</w:t>
             </w:r>
-            <w:proofErr w:type="spellEnd"/>
             <w:r>
               <w:rPr>
                 <w:rFonts w:ascii="Calibri" w:hAnsi="Calibri" w:cs="Calibri"/>
                 <w:lang w:val="en-GB"/>
               </w:rPr>
-              <w:t xml:space="preserve"> / OLDEST_T50/T20.txt</w:t>
+              <w:t>_cache_FIFO</w:t>
+            </w:r>
+            <w:r>
+              <w:rPr>
+                <w:rFonts w:ascii="Calibri" w:hAnsi="Calibri" w:cs="Calibri"/>
+                <w:lang w:val="en-GB"/>
+              </w:rPr>
+              <w:t>_T50.txt</w:t>
+            </w:r>
+            <w:r>
+              <w:rPr>
+                <w:rFonts w:ascii="Calibri" w:hAnsi="Calibri" w:cs="Calibri"/>
+                <w:lang w:val="en-GB"/>
+              </w:rPr>
+              <w:t xml:space="preserve">/ </w:t>
+            </w:r>
+            <w:r>
+              <w:rPr>
+                <w:rFonts w:ascii="Calibri" w:hAnsi="Calibri" w:cs="Calibri"/>
+                <w:lang w:val="en-GB"/>
+              </w:rPr>
+              <w:t>client</w:t>
+            </w:r>
+            <w:r>
+              <w:rPr>
+                <w:rFonts w:ascii="Calibri" w:hAnsi="Calibri" w:cs="Calibri"/>
+                <w:lang w:val="en-GB"/>
+              </w:rPr>
+              <w:t>_cache_FIFO</w:t>
+            </w:r>
+            <w:r>
+              <w:rPr>
+                <w:rFonts w:ascii="Calibri" w:hAnsi="Calibri" w:cs="Calibri"/>
+                <w:lang w:val="en-GB"/>
+              </w:rPr>
+              <w:t>_T20.txt</w:t>
+            </w:r>
+            <w:r>
+              <w:rPr>
+                <w:rFonts w:ascii="Calibri" w:hAnsi="Calibri" w:cs="Calibri"/>
+                <w:lang w:val="en-GB"/>
+              </w:rPr>
+              <w:t>/</w:t>
+            </w:r>
+          </w:p>
+          <w:p>
+            <w:pPr>
+              <w:pStyle w:val="Brdtekst"/>
+              <w:rPr>
+                <w:rFonts w:ascii="Calibri" w:hAnsi="Calibri" w:cs="Calibri"/>
+                <w:lang w:val="en-GB"/>
+              </w:rPr>
+            </w:pPr>
+            <w:r>
+              <w:rPr>
+                <w:rFonts w:ascii="Calibri" w:hAnsi="Calibri" w:cs="Calibri"/>
+                <w:lang w:val="en-GB"/>
+              </w:rPr>
+              <w:t>client</w:t>
+            </w:r>
+            <w:r>
+              <w:rPr>
+                <w:rFonts w:ascii="Calibri" w:hAnsi="Calibri" w:cs="Calibri"/>
+                <w:lang w:val="en-GB"/>
+              </w:rPr>
+              <w:t>_cache_OLDEST_T50</w:t>
+            </w:r>
+            <w:r>
+              <w:rPr>
+                <w:rFonts w:ascii="Calibri" w:hAnsi="Calibri" w:cs="Calibri"/>
+                <w:lang w:val="en-GB"/>
+              </w:rPr>
+              <w:t>.txt/ client</w:t>
+            </w:r>
+            <w:r>
+              <w:rPr>
+                <w:rFonts w:ascii="Calibri" w:hAnsi="Calibri" w:cs="Calibri"/>
+                <w:lang w:val="en-GB"/>
+              </w:rPr>
+              <w:t>_cache_OLDEST_T</w:t>
+            </w:r>
+            <w:r>
+              <w:rPr>
+                <w:rFonts w:ascii="Calibri" w:hAnsi="Calibri" w:cs="Calibri"/>
+                <w:lang w:val="en-GB"/>
+              </w:rPr>
+              <w:t>2</w:t>
+            </w:r>
+            <w:r>
+              <w:rPr>
+                <w:rFonts w:ascii="Calibri" w:hAnsi="Calibri" w:cs="Calibri"/>
+                <w:lang w:val="en-GB"/>
+              </w:rPr>
+              <w:t>0</w:t>
+            </w:r>
+            <w:r>
+              <w:rPr>
+                <w:rFonts w:ascii="Calibri" w:hAnsi="Calibri" w:cs="Calibri"/>
+                <w:lang w:val="en-GB"/>
+              </w:rPr>
+              <w:t>.txt</w:t>
             </w:r>
           </w:p>
         </w:tc>
@@ -8178,9 +8458,9 @@
     <w:rsidRoot w:val="007B0874"/>
     <w:rsid w:val="0024673D"/>
     <w:rsid w:val="00295677"/>
+    <w:rsid w:val="004D5CD5"/>
     <w:rsid w:val="007B0874"/>
     <w:rsid w:val="009E3AE8"/>
-    <w:rsid w:val="00AD58E5"/>
     <w:rsid w:val="00DA3137"/>
     <w:rsid w:val="00DF470B"/>
   </w:rsids>

</xml_diff>